<commit_message>
docs: updated all document
</commit_message>
<xml_diff>
--- a/docs/BiaTrongVaBiaNgoai_BaoCaoTomTat.docx
+++ b/docs/BiaTrongVaBiaNgoai_BaoCaoTomTat.docx
@@ -472,7 +472,7 @@
           <w:szCs w:val="28"/>
           <w:lang w:val="fr-FR"/>
         </w:rPr>
-        <w:t>1</w:t>
+        <w:t>0</w:t>
       </w:r>
     </w:p>
     <w:p>
@@ -861,7 +861,18 @@
           <w:sz w:val="48"/>
           <w:szCs w:val="48"/>
         </w:rPr>
-        <w:t>XÂY DỰNG HỆ THỐNG QUẢN LÝ NHÀ HÀNG THEO MÔ HÌNH TƯƠNG TÁC SỐ ĐA KÊNH</w:t>
+        <w:t>XÂY DỰNG HỆ THỐNG QUẢN LÝ NHÀ HÀNG THEO M</w:t>
+      </w:r>
+      <w:bookmarkStart w:id="0" w:name="_GoBack"/>
+      <w:bookmarkEnd w:id="0"/>
+      <w:r>
+        <w:rPr>
+          <w:b/>
+          <w:noProof/>
+          <w:sz w:val="48"/>
+          <w:szCs w:val="48"/>
+        </w:rPr>
+        <w:t>Ô HÌNH TƯƠNG TÁC SỐ ĐA KÊNH</w:t>
       </w:r>
     </w:p>
     <w:p>
@@ -1173,7 +1184,7 @@
           <w:szCs w:val="28"/>
           <w:lang w:val="fr-FR"/>
         </w:rPr>
-        <w:t>1</w:t>
+        <w:t>0</w:t>
       </w:r>
     </w:p>
     <w:p>
@@ -1286,8 +1297,6 @@
         </w:rPr>
         <w:t>Th</w:t>
       </w:r>
-      <w:bookmarkStart w:id="0" w:name="_GoBack"/>
-      <w:bookmarkEnd w:id="0"/>
       <w:r>
         <w:rPr>
           <w:b/>

</xml_diff>